<commit_message>
updated AI usage doc
</commit_message>
<xml_diff>
--- a/docs/phase3/ai-usage.docx
+++ b/docs/phase3/ai-usage.docx
@@ -711,18 +711,9 @@
                 <w:rFonts w:ascii="Times New Roman" w:hAnsi="Times New Roman" w:cs="Times New Roman"/>
               </w:rPr>
             </w:pPr>
-          </w:p>
-          <w:p>
-            <w:pPr>
-              <w:spacing w:after="0" w:line="480" w:lineRule="auto"/>
-              <w:jc w:val="center"/>
-              <w:rPr>
-                <w:rFonts w:ascii="Times New Roman" w:hAnsi="Times New Roman" w:cs="Times New Roman"/>
-              </w:rPr>
-            </w:pPr>
-            <w:r>
-              <w:rPr>
-                <w:rFonts w:ascii="Times New Roman" w:eastAsia="Aptos" w:hAnsi="Times New Roman" w:cs="Times New Roman"/>
+            <w:r>
+              <w:rPr>
+                <w:rFonts w:ascii="Times New Roman" w:hAnsi="Times New Roman" w:cs="Times New Roman"/>
               </w:rPr>
               <w:lastRenderedPageBreak/>
               <w:t>Daniel Austin</w:t>
@@ -750,22 +741,21 @@
                 <w:rFonts w:ascii="Times New Roman" w:hAnsi="Times New Roman" w:cs="Times New Roman"/>
               </w:rPr>
             </w:pPr>
-          </w:p>
-          <w:p>
-            <w:pPr>
-              <w:spacing w:after="0" w:line="480" w:lineRule="auto"/>
-              <w:jc w:val="center"/>
-              <w:rPr>
-                <w:rFonts w:ascii="Times New Roman" w:hAnsi="Times New Roman" w:cs="Times New Roman"/>
-              </w:rPr>
-            </w:pPr>
-            <w:r>
-              <w:rPr>
-                <w:rFonts w:ascii="Times New Roman" w:eastAsia="Aptos" w:hAnsi="Times New Roman" w:cs="Times New Roman"/>
-              </w:rPr>
-              <w:lastRenderedPageBreak/>
+            <w:r>
+              <w:rPr>
+                <w:rFonts w:ascii="Times New Roman" w:hAnsi="Times New Roman" w:cs="Times New Roman"/>
+              </w:rPr>
               <w:t>Developer</w:t>
             </w:r>
+          </w:p>
+          <w:p>
+            <w:pPr>
+              <w:spacing w:after="0" w:line="480" w:lineRule="auto"/>
+              <w:jc w:val="center"/>
+              <w:rPr>
+                <w:rFonts w:ascii="Times New Roman" w:hAnsi="Times New Roman" w:cs="Times New Roman"/>
+              </w:rPr>
+            </w:pPr>
           </w:p>
         </w:tc>
         <w:tc>
@@ -780,6 +770,12 @@
                 <w:rFonts w:ascii="Times New Roman" w:hAnsi="Times New Roman" w:cs="Times New Roman"/>
               </w:rPr>
             </w:pPr>
+            <w:r>
+              <w:rPr>
+                <w:rFonts w:ascii="Times New Roman" w:hAnsi="Times New Roman" w:cs="Times New Roman"/>
+              </w:rPr>
+              <w:t>ChatGPT and Perplexity.ai were both used in the testing and debugging of login/ dashboard code as well as to establish the connection between the dashboard and the SQL database for the purpose of data visualization.</w:t>
+            </w:r>
           </w:p>
         </w:tc>
       </w:tr>
@@ -1674,6 +1670,7 @@
   <w:style w:type="character" w:default="1" w:styleId="DefaultParagraphFont">
     <w:name w:val="Default Paragraph Font"/>
     <w:uiPriority w:val="1"/>
+    <w:semiHidden/>
     <w:unhideWhenUsed/>
   </w:style>
   <w:style w:type="table" w:default="1" w:styleId="TableNormal">

</xml_diff>